<commit_message>
Rename persis.site -> persis.my
Updates the domain reference in .env.example and the generated Word
deliverables (user guide, explainer video script). No source code hardcodes
the domain — production uses the NEXTAUTH_URL env var.
</commit_message>
<xml_diff>
--- a/PERSIS-User-Guide.docx
+++ b/PERSIS-User-Guide.docx
@@ -38,7 +38,7 @@
         <w:rPr>
           <w:color w:val="1a56db"/>
         </w:rPr>
-        <w:t xml:space="preserve">www.persis.site</w:t>
+        <w:t xml:space="preserve">www.persis.my</w:t>
       </w:r>
     </w:p>
     <w:p>
@@ -327,7 +327,7 @@
         <w:t xml:space="preserve">1. </w:t>
       </w:r>
       <w:r>
-        <w:t xml:space="preserve">Go to www.persis.site and register with your email, or sign in with Google.</w:t>
+        <w:t xml:space="preserve">Go to www.persis.my and register with your email, or sign in with Google.</w:t>
       </w:r>
     </w:p>
     <w:p>

</xml_diff>